<commit_message>
trlc: add sw_req_docx_render_gfm traceability and GFM examples
</commit_message>
<xml_diff>
--- a/tools/trlc2other/converter/template.docx
+++ b/tools/trlc2other/converter/template.docx
@@ -13,6 +13,7 @@
       <w:bookmarkStart w:id="0" w:name="_Toc192404323"/>
       <w:r>
         <w:rPr>
+          <w:noProof/>
           <w:lang w:val="en-US" w:eastAsia="de-DE"/>
         </w:rPr>
         <w:drawing>
@@ -150,7 +151,6 @@
       <w:footerReference w:type="first" r:id="rId18"/>
       <w:pgSz w:w="11907" w:h="16839"/>
       <w:pgMar w:top="1440" w:right="1440" w:bottom="1440" w:left="1440" w:header="720" w:footer="720" w:gutter="0"/>
-      <w:pgNumType w:start="1"/>
       <w:cols w:space="720"/>
       <w:titlePg/>
       <w:docGrid w:linePitch="360"/>
@@ -222,21 +222,44 @@
       <w:rPr>
         <w:lang w:val="en-US"/>
       </w:rPr>
-      <w:t xml:space="preserve">opyright (c) 2024 - 2025 </w:t>
+      <w:t xml:space="preserve">opyright (c) 2024 - </w:t>
     </w:r>
-    <w:proofErr w:type="spellStart"/>
     <w:r>
       <w:rPr>
         <w:lang w:val="en-US"/>
       </w:rPr>
-      <w:t>NewTec</w:t>
+      <w:fldChar w:fldCharType="begin"/>
     </w:r>
-    <w:proofErr w:type="spellEnd"/>
     <w:r>
       <w:rPr>
         <w:lang w:val="en-US"/>
       </w:rPr>
-      <w:t xml:space="preserve"> GmbH </w:t>
+      <w:instrText xml:space="preserve"> DATE  \@ "yyyy"  \* MERGEFORMAT </w:instrText>
+    </w:r>
+    <w:r>
+      <w:rPr>
+        <w:lang w:val="en-US"/>
+      </w:rPr>
+      <w:fldChar w:fldCharType="separate"/>
+    </w:r>
+    <w:r>
+      <w:rPr>
+        <w:noProof/>
+        <w:lang w:val="en-US"/>
+      </w:rPr>
+      <w:t>2026</w:t>
+    </w:r>
+    <w:r>
+      <w:rPr>
+        <w:lang w:val="en-US"/>
+      </w:rPr>
+      <w:fldChar w:fldCharType="end"/>
+    </w:r>
+    <w:r>
+      <w:rPr>
+        <w:lang w:val="en-US"/>
+      </w:rPr>
+      <w:t xml:space="preserve"> NewTec GmbH </w:t>
     </w:r>
     <w:r>
       <w:rPr>
@@ -353,21 +376,7 @@
       <w:rPr>
         <w:lang w:val="en-US"/>
       </w:rPr>
-      <w:t xml:space="preserve">opyright (c) 2024 - 2025 </w:t>
-    </w:r>
-    <w:proofErr w:type="spellStart"/>
-    <w:r>
-      <w:rPr>
-        <w:lang w:val="en-US"/>
-      </w:rPr>
-      <w:t>NewTec</w:t>
-    </w:r>
-    <w:proofErr w:type="spellEnd"/>
-    <w:r>
-      <w:rPr>
-        <w:lang w:val="en-US"/>
-      </w:rPr>
-      <w:t xml:space="preserve"> GmbH </w:t>
+      <w:t xml:space="preserve">opyright (c) 2024 - 2025 NewTec GmbH </w:t>
     </w:r>
     <w:r>
       <w:rPr>
@@ -499,21 +508,50 @@
       <w:rPr>
         <w:lang w:val="en-US"/>
       </w:rPr>
-      <w:t xml:space="preserve">opyright (c) 2024 - 2025 </w:t>
+      <w:t>opyright (c) 2024 -</w:t>
     </w:r>
-    <w:proofErr w:type="spellStart"/>
     <w:r>
       <w:rPr>
         <w:lang w:val="en-US"/>
       </w:rPr>
-      <w:t>NewTec</w:t>
+      <w:t xml:space="preserve"> </w:t>
     </w:r>
-    <w:proofErr w:type="spellEnd"/>
     <w:r>
       <w:rPr>
         <w:lang w:val="en-US"/>
       </w:rPr>
-      <w:t xml:space="preserve"> GmbH </w:t>
+      <w:fldChar w:fldCharType="begin"/>
+    </w:r>
+    <w:r>
+      <w:rPr>
+        <w:lang w:val="en-US"/>
+      </w:rPr>
+      <w:instrText xml:space="preserve"> DATE  \@ "yyyy"  \* MERGEFORMAT </w:instrText>
+    </w:r>
+    <w:r>
+      <w:rPr>
+        <w:lang w:val="en-US"/>
+      </w:rPr>
+      <w:fldChar w:fldCharType="separate"/>
+    </w:r>
+    <w:r>
+      <w:rPr>
+        <w:noProof/>
+        <w:lang w:val="en-US"/>
+      </w:rPr>
+      <w:t>2026</w:t>
+    </w:r>
+    <w:r>
+      <w:rPr>
+        <w:lang w:val="en-US"/>
+      </w:rPr>
+      <w:fldChar w:fldCharType="end"/>
+    </w:r>
+    <w:r>
+      <w:rPr>
+        <w:lang w:val="en-US"/>
+      </w:rPr>
+      <w:t xml:space="preserve"> NewTec GmbH </w:t>
     </w:r>
     <w:r>
       <w:rPr>
@@ -531,7 +569,7 @@
       <w:rPr>
         <w:lang w:val="en-US"/>
       </w:rPr>
-      <w:instrText>PAGE   \* MERGEFORMAT</w:instrText>
+      <w:instrText xml:space="preserve"> PAGE   \* MERGEFORMAT </w:instrText>
     </w:r>
     <w:r>
       <w:rPr>
@@ -541,6 +579,7 @@
     </w:r>
     <w:r>
       <w:rPr>
+        <w:noProof/>
         <w:lang w:val="en-US"/>
       </w:rPr>
       <w:t>1</w:t>
@@ -27154,27 +27193,6 @@
 </file>
 
 <file path=customXml/item1.xml><?xml version="1.0" encoding="utf-8"?>
-<?mso-contentType ?>
-<FormTemplates xmlns="http://schemas.microsoft.com/sharepoint/v3/contenttype/forms">
-  <Display>DocumentLibraryForm</Display>
-  <Edit>DocumentLibraryForm</Edit>
-  <New>DocumentLibraryForm</New>
-</FormTemplates>
-</file>
-
-<file path=customXml/item2.xml><?xml version="1.0" encoding="utf-8"?>
-<p:properties xmlns:p="http://schemas.microsoft.com/office/2006/metadata/properties" xmlns:xsi="http://www.w3.org/2001/XMLSchema-instance" xmlns:pc="http://schemas.microsoft.com/office/infopath/2007/PartnerControls">
-  <documentManagement>
-    <_activity xmlns="daed746b-5112-4701-9d28-6e3b87e92595" xsi:nil="true"/>
-  </documentManagement>
-</p:properties>
-</file>
-
-<file path=customXml/item3.xml><?xml version="1.0" encoding="utf-8"?>
-<b:Sources xmlns:b="http://schemas.openxmlformats.org/officeDocument/2006/bibliography" xmlns="http://schemas.openxmlformats.org/officeDocument/2006/bibliography" SelectedStyle="\APASixthEditionOfficeOnline.xsl" StyleName="APA" Version="6"/>
-</file>
-
-<file path=customXml/item4.xml><?xml version="1.0" encoding="utf-8"?>
 <ct:contentTypeSchema xmlns:ct="http://schemas.microsoft.com/office/2006/metadata/contentType" xmlns:ma="http://schemas.microsoft.com/office/2006/metadata/properties/metaAttributes" ct:_="" ma:_="" ma:contentTypeName="Dokument" ma:contentTypeID="0x010100708C7A8D2A52B044AC62F11761A18569" ma:contentTypeVersion="15" ma:contentTypeDescription="Ein neues Dokument erstellen." ma:contentTypeScope="" ma:versionID="958879c1b9121c9a13b2d9acac913d84">
   <xsd:schema xmlns:xsd="http://www.w3.org/2001/XMLSchema" xmlns:xs="http://www.w3.org/2001/XMLSchema" xmlns:p="http://schemas.microsoft.com/office/2006/metadata/properties" xmlns:ns3="515c2285-97b2-4c42-bb4d-0c33f4faec93" xmlns:ns4="daed746b-5112-4701-9d28-6e3b87e92595" targetNamespace="http://schemas.microsoft.com/office/2006/metadata/properties" ma:root="true" ma:fieldsID="e68746f0c67e5be9e77a78420c45a453" ns3:_="" ns4:_="">
     <xsd:import namespace="515c2285-97b2-4c42-bb4d-0c33f4faec93"/>
@@ -27407,40 +27425,28 @@
 </ct:contentTypeSchema>
 </file>
 
-<file path=customXml/itemProps1.xml><?xml version="1.0" encoding="utf-8"?>
-<ds:datastoreItem xmlns:ds="http://schemas.openxmlformats.org/officeDocument/2006/customXml" ds:itemID="{0FAFCD8E-98A3-4BBD-86C5-F6323B448734}">
-  <ds:schemaRefs>
-    <ds:schemaRef ds:uri="http://schemas.microsoft.com/sharepoint/v3/contenttype/forms"/>
-  </ds:schemaRefs>
-</ds:datastoreItem>
+<file path=customXml/item2.xml><?xml version="1.0" encoding="utf-8"?>
+<?mso-contentType ?>
+<FormTemplates xmlns="http://schemas.microsoft.com/sharepoint/v3/contenttype/forms">
+  <Display>DocumentLibraryForm</Display>
+  <Edit>DocumentLibraryForm</Edit>
+  <New>DocumentLibraryForm</New>
+</FormTemplates>
 </file>
 
-<file path=customXml/itemProps2.xml><?xml version="1.0" encoding="utf-8"?>
-<ds:datastoreItem xmlns:ds="http://schemas.openxmlformats.org/officeDocument/2006/customXml" ds:itemID="{9EC29C7C-EA13-46FE-BFFA-3F1E43EDB19C}">
-  <ds:schemaRefs>
-    <ds:schemaRef ds:uri="daed746b-5112-4701-9d28-6e3b87e92595"/>
-    <ds:schemaRef ds:uri="http://schemas.microsoft.com/office/2006/metadata/properties"/>
-    <ds:schemaRef ds:uri="http://www.w3.org/XML/1998/namespace"/>
-    <ds:schemaRef ds:uri="515c2285-97b2-4c42-bb4d-0c33f4faec93"/>
-    <ds:schemaRef ds:uri="http://purl.org/dc/terms/"/>
-    <ds:schemaRef ds:uri="http://schemas.microsoft.com/office/infopath/2007/PartnerControls"/>
-    <ds:schemaRef ds:uri="http://schemas.microsoft.com/office/2006/documentManagement/types"/>
-    <ds:schemaRef ds:uri="http://schemas.openxmlformats.org/package/2006/metadata/core-properties"/>
-    <ds:schemaRef ds:uri="http://purl.org/dc/dcmitype/"/>
-    <ds:schemaRef ds:uri="http://purl.org/dc/elements/1.1/"/>
-  </ds:schemaRefs>
-</ds:datastoreItem>
+<file path=customXml/item3.xml><?xml version="1.0" encoding="utf-8"?>
+<p:properties xmlns:p="http://schemas.microsoft.com/office/2006/metadata/properties" xmlns:xsi="http://www.w3.org/2001/XMLSchema-instance" xmlns:pc="http://schemas.microsoft.com/office/infopath/2007/PartnerControls">
+  <documentManagement>
+    <_activity xmlns="daed746b-5112-4701-9d28-6e3b87e92595" xsi:nil="true"/>
+  </documentManagement>
+</p:properties>
 </file>
 
-<file path=customXml/itemProps3.xml><?xml version="1.0" encoding="utf-8"?>
-<ds:datastoreItem xmlns:ds="http://schemas.openxmlformats.org/officeDocument/2006/customXml" ds:itemID="{8A9C49F0-CCD9-4ACC-83AD-4FB2D0FCB166}">
-  <ds:schemaRefs>
-    <ds:schemaRef ds:uri="http://schemas.openxmlformats.org/officeDocument/2006/bibliography"/>
-  </ds:schemaRefs>
-</ds:datastoreItem>
+<file path=customXml/item4.xml><?xml version="1.0" encoding="utf-8"?>
+<b:Sources xmlns:b="http://schemas.openxmlformats.org/officeDocument/2006/bibliography" xmlns="http://schemas.openxmlformats.org/officeDocument/2006/bibliography" SelectedStyle="\APASixthEditionOfficeOnline.xsl" StyleName="APA" Version="6"/>
 </file>
 
-<file path=customXml/itemProps4.xml><?xml version="1.0" encoding="utf-8"?>
+<file path=customXml/itemProps1.xml><?xml version="1.0" encoding="utf-8"?>
 <ds:datastoreItem xmlns:ds="http://schemas.openxmlformats.org/officeDocument/2006/customXml" ds:itemID="{BF4D76A0-8080-4375-81F3-67C4B99EECA0}">
   <ds:schemaRefs>
     <ds:schemaRef ds:uri="http://schemas.microsoft.com/office/2006/metadata/contentType"/>
@@ -27457,4 +27463,30 @@
     <ds:schemaRef ds:uri="http://schemas.microsoft.com/internal/obd"/>
   </ds:schemaRefs>
 </ds:datastoreItem>
+</file>
+
+<file path=customXml/itemProps2.xml><?xml version="1.0" encoding="utf-8"?>
+<ds:datastoreItem xmlns:ds="http://schemas.openxmlformats.org/officeDocument/2006/customXml" ds:itemID="{0FAFCD8E-98A3-4BBD-86C5-F6323B448734}">
+  <ds:schemaRefs>
+    <ds:schemaRef ds:uri="http://schemas.microsoft.com/sharepoint/v3/contenttype/forms"/>
+  </ds:schemaRefs>
+</ds:datastoreItem>
+</file>
+
+<file path=customXml/itemProps3.xml><?xml version="1.0" encoding="utf-8"?>
+<ds:datastoreItem xmlns:ds="http://schemas.openxmlformats.org/officeDocument/2006/customXml" ds:itemID="{9EC29C7C-EA13-46FE-BFFA-3F1E43EDB19C}">
+  <ds:schemaRefs>
+    <ds:schemaRef ds:uri="http://schemas.microsoft.com/office/2006/metadata/properties"/>
+    <ds:schemaRef ds:uri="http://schemas.microsoft.com/office/infopath/2007/PartnerControls"/>
+    <ds:schemaRef ds:uri="daed746b-5112-4701-9d28-6e3b87e92595"/>
+  </ds:schemaRefs>
+</ds:datastoreItem>
+</file>
+
+<file path=customXml/itemProps4.xml><?xml version="1.0" encoding="utf-8"?>
+<ds:datastoreItem xmlns:ds="http://schemas.openxmlformats.org/officeDocument/2006/customXml" ds:itemID="{8A9C49F0-CCD9-4ACC-83AD-4FB2D0FCB166}">
+  <ds:schemaRefs>
+    <ds:schemaRef ds:uri="http://schemas.openxmlformats.org/officeDocument/2006/bibliography"/>
+  </ds:schemaRefs>
+</ds:datastoreItem>
 </file>
</xml_diff>